<commit_message>
OTC: add on-ramp + off-ramp trade examples
- USDC/USD: 3 Buy (on-ramp 1.5M USDC) + 2 Sell (off-ramp 750k USDC)
- BTC/USD:  2 Buy (on-ramp 15 BTC)
- ETH/USD:  1 Sell (off-ramp 50 ETH)
- Fiat USD added to ASSET_CHAIN_DEFAULT as 'Bank'; settlement legs
  render the USD side as a SWIFT MT103 reference in the Transaction
  ID column.

Co-Authored-By: Claude Opus 4.7 <noreply@anthropic.com>
</commit_message>
<xml_diff>
--- a/mockup/monthly_client_statement/sample-statements/OTCTrading_Simplified_sample.docx
+++ b/mockup/monthly_client_statement/sample-statements/OTCTrading_Simplified_sample.docx
@@ -2185,6 +2185,569 @@
         <w:tc>
           <w:tcPr>
             <w:tcW w:type="dxa" w:w="1304"/>
+            <w:shd w:val="clear" w:color="auto" w:fill="F5F7FA"/>
+            <w:tcBorders>
+              <w:bottom w:val="single" w:sz="4" w:color="D0D5DD"/>
+            </w:tcBorders>
+            <w:vAlign w:val="center"/>
+          </w:tcPr>
+          <w:p>
+            <w:pPr>
+              <w:spacing w:before="40" w:after="40"/>
+            </w:pPr>
+            <w:r>
+              <w:rPr>
+                <w:rFonts w:ascii="Arial" w:hAnsi="Arial"/>
+                <w:rFonts w:ascii="Arial" w:hAnsi="Arial" w:cs="Arial"/>
+                <w:b w:val="0"/>
+                <w:i w:val="0"/>
+                <w:color w:val="4A5568"/>
+                <w:sz w:val="16"/>
+              </w:rPr>
+              <w:t>USDC/USD</w:t>
+            </w:r>
+          </w:p>
+        </w:tc>
+        <w:tc>
+          <w:tcPr>
+            <w:tcW w:type="dxa" w:w="964"/>
+            <w:shd w:val="clear" w:color="auto" w:fill="F5F7FA"/>
+            <w:tcBorders>
+              <w:bottom w:val="single" w:sz="4" w:color="D0D5DD"/>
+            </w:tcBorders>
+            <w:vAlign w:val="center"/>
+          </w:tcPr>
+          <w:p>
+            <w:pPr>
+              <w:spacing w:before="40" w:after="40"/>
+              <w:jc w:val="right"/>
+            </w:pPr>
+            <w:r>
+              <w:rPr>
+                <w:rFonts w:ascii="Arial" w:hAnsi="Arial"/>
+                <w:rFonts w:ascii="Arial" w:hAnsi="Arial" w:cs="Arial"/>
+                <w:b w:val="0"/>
+                <w:i w:val="0"/>
+                <w:color w:val="4A5568"/>
+                <w:sz w:val="16"/>
+              </w:rPr>
+              <w:t>5</w:t>
+            </w:r>
+          </w:p>
+        </w:tc>
+        <w:tc>
+          <w:tcPr>
+            <w:tcW w:type="dxa" w:w="1757"/>
+            <w:shd w:val="clear" w:color="auto" w:fill="F5F7FA"/>
+            <w:tcBorders>
+              <w:bottom w:val="single" w:sz="4" w:color="D0D5DD"/>
+            </w:tcBorders>
+            <w:vAlign w:val="center"/>
+          </w:tcPr>
+          <w:p>
+            <w:pPr>
+              <w:spacing w:before="40" w:after="40"/>
+              <w:jc w:val="right"/>
+            </w:pPr>
+            <w:r>
+              <w:rPr>
+                <w:rFonts w:ascii="Arial" w:hAnsi="Arial"/>
+                <w:rFonts w:ascii="Arial" w:hAnsi="Arial" w:cs="Arial"/>
+                <w:b w:val="0"/>
+                <w:i w:val="0"/>
+                <w:color w:val="4A5568"/>
+                <w:sz w:val="16"/>
+              </w:rPr>
+              <w:t>$750,000.00</w:t>
+            </w:r>
+          </w:p>
+        </w:tc>
+        <w:tc>
+          <w:tcPr>
+            <w:tcW w:type="dxa" w:w="1871"/>
+            <w:shd w:val="clear" w:color="auto" w:fill="F5F7FA"/>
+            <w:tcBorders>
+              <w:bottom w:val="single" w:sz="4" w:color="D0D5DD"/>
+            </w:tcBorders>
+            <w:vAlign w:val="center"/>
+          </w:tcPr>
+          <w:p>
+            <w:pPr>
+              <w:spacing w:before="40" w:after="40"/>
+              <w:jc w:val="right"/>
+            </w:pPr>
+            <w:r>
+              <w:rPr>
+                <w:rFonts w:ascii="Arial" w:hAnsi="Arial"/>
+                <w:rFonts w:ascii="Arial" w:hAnsi="Arial" w:cs="Arial"/>
+                <w:b w:val="0"/>
+                <w:i w:val="0"/>
+                <w:color w:val="15803D"/>
+                <w:sz w:val="16"/>
+              </w:rPr>
+              <w:t>+750,000.0000 USDC</w:t>
+            </w:r>
+          </w:p>
+        </w:tc>
+        <w:tc>
+          <w:tcPr>
+            <w:tcW w:type="dxa" w:w="1644"/>
+            <w:shd w:val="clear" w:color="auto" w:fill="F5F7FA"/>
+            <w:tcBorders>
+              <w:bottom w:val="single" w:sz="4" w:color="D0D5DD"/>
+            </w:tcBorders>
+            <w:vAlign w:val="center"/>
+          </w:tcPr>
+          <w:p>
+            <w:pPr>
+              <w:spacing w:before="40" w:after="40"/>
+              <w:jc w:val="right"/>
+            </w:pPr>
+            <w:r>
+              <w:rPr>
+                <w:rFonts w:ascii="Arial" w:hAnsi="Arial"/>
+                <w:rFonts w:ascii="Arial" w:hAnsi="Arial" w:cs="Arial"/>
+                <w:b w:val="0"/>
+                <w:i w:val="0"/>
+                <w:color w:val="4A5568"/>
+                <w:sz w:val="16"/>
+              </w:rPr>
+              <w:t>$1.0000</w:t>
+            </w:r>
+          </w:p>
+        </w:tc>
+        <w:tc>
+          <w:tcPr>
+            <w:tcW w:type="dxa" w:w="1077"/>
+            <w:shd w:val="clear" w:color="auto" w:fill="F5F7FA"/>
+            <w:tcBorders>
+              <w:bottom w:val="single" w:sz="4" w:color="D0D5DD"/>
+            </w:tcBorders>
+            <w:vAlign w:val="center"/>
+          </w:tcPr>
+          <w:p>
+            <w:pPr>
+              <w:spacing w:before="40" w:after="40"/>
+              <w:jc w:val="right"/>
+            </w:pPr>
+            <w:r>
+              <w:rPr>
+                <w:rFonts w:ascii="Arial" w:hAnsi="Arial"/>
+                <w:rFonts w:ascii="Arial" w:hAnsi="Arial" w:cs="Arial"/>
+                <w:b w:val="0"/>
+                <w:i w:val="0"/>
+                <w:color w:val="4A5568"/>
+                <w:sz w:val="16"/>
+              </w:rPr>
+              <w:t>5</w:t>
+            </w:r>
+          </w:p>
+        </w:tc>
+        <w:tc>
+          <w:tcPr>
+            <w:tcW w:type="dxa" w:w="1587"/>
+            <w:shd w:val="clear" w:color="auto" w:fill="F5F7FA"/>
+            <w:tcBorders>
+              <w:bottom w:val="single" w:sz="4" w:color="D0D5DD"/>
+            </w:tcBorders>
+            <w:vAlign w:val="center"/>
+          </w:tcPr>
+          <w:p>
+            <w:pPr>
+              <w:spacing w:before="40" w:after="40"/>
+              <w:jc w:val="right"/>
+            </w:pPr>
+            <w:r>
+              <w:rPr>
+                <w:rFonts w:ascii="Arial" w:hAnsi="Arial"/>
+                <w:rFonts w:ascii="Arial" w:hAnsi="Arial" w:cs="Arial"/>
+                <w:b w:val="0"/>
+                <w:i w:val="0"/>
+                <w:color w:val="4A5568"/>
+                <w:sz w:val="16"/>
+              </w:rPr>
+              <w:t>—</w:t>
+            </w:r>
+          </w:p>
+        </w:tc>
+      </w:tr>
+      <w:tr>
+        <w:tc>
+          <w:tcPr>
+            <w:tcW w:type="dxa" w:w="1304"/>
+            <w:tcBorders>
+              <w:bottom w:val="single" w:sz="4" w:color="D0D5DD"/>
+            </w:tcBorders>
+            <w:vAlign w:val="center"/>
+          </w:tcPr>
+          <w:p>
+            <w:pPr>
+              <w:spacing w:before="40" w:after="40"/>
+            </w:pPr>
+            <w:r>
+              <w:rPr>
+                <w:rFonts w:ascii="Arial" w:hAnsi="Arial"/>
+                <w:rFonts w:ascii="Arial" w:hAnsi="Arial" w:cs="Arial"/>
+                <w:b w:val="0"/>
+                <w:i w:val="0"/>
+                <w:color w:val="4A5568"/>
+                <w:sz w:val="16"/>
+              </w:rPr>
+              <w:t>BTC/USD</w:t>
+            </w:r>
+          </w:p>
+        </w:tc>
+        <w:tc>
+          <w:tcPr>
+            <w:tcW w:type="dxa" w:w="964"/>
+            <w:tcBorders>
+              <w:bottom w:val="single" w:sz="4" w:color="D0D5DD"/>
+            </w:tcBorders>
+            <w:vAlign w:val="center"/>
+          </w:tcPr>
+          <w:p>
+            <w:pPr>
+              <w:spacing w:before="40" w:after="40"/>
+              <w:jc w:val="right"/>
+            </w:pPr>
+            <w:r>
+              <w:rPr>
+                <w:rFonts w:ascii="Arial" w:hAnsi="Arial"/>
+                <w:rFonts w:ascii="Arial" w:hAnsi="Arial" w:cs="Arial"/>
+                <w:b w:val="0"/>
+                <w:i w:val="0"/>
+                <w:color w:val="4A5568"/>
+                <w:sz w:val="16"/>
+              </w:rPr>
+              <w:t>2</w:t>
+            </w:r>
+          </w:p>
+        </w:tc>
+        <w:tc>
+          <w:tcPr>
+            <w:tcW w:type="dxa" w:w="1757"/>
+            <w:tcBorders>
+              <w:bottom w:val="single" w:sz="4" w:color="D0D5DD"/>
+            </w:tcBorders>
+            <w:vAlign w:val="center"/>
+          </w:tcPr>
+          <w:p>
+            <w:pPr>
+              <w:spacing w:before="40" w:after="40"/>
+              <w:jc w:val="right"/>
+            </w:pPr>
+            <w:r>
+              <w:rPr>
+                <w:rFonts w:ascii="Arial" w:hAnsi="Arial"/>
+                <w:rFonts w:ascii="Arial" w:hAnsi="Arial" w:cs="Arial"/>
+                <w:b w:val="0"/>
+                <w:i w:val="0"/>
+                <w:color w:val="4A5568"/>
+                <w:sz w:val="16"/>
+              </w:rPr>
+              <w:t>$1,215,000.00</w:t>
+            </w:r>
+          </w:p>
+        </w:tc>
+        <w:tc>
+          <w:tcPr>
+            <w:tcW w:type="dxa" w:w="1871"/>
+            <w:tcBorders>
+              <w:bottom w:val="single" w:sz="4" w:color="D0D5DD"/>
+            </w:tcBorders>
+            <w:vAlign w:val="center"/>
+          </w:tcPr>
+          <w:p>
+            <w:pPr>
+              <w:spacing w:before="40" w:after="40"/>
+              <w:jc w:val="right"/>
+            </w:pPr>
+            <w:r>
+              <w:rPr>
+                <w:rFonts w:ascii="Arial" w:hAnsi="Arial"/>
+                <w:rFonts w:ascii="Arial" w:hAnsi="Arial" w:cs="Arial"/>
+                <w:b w:val="0"/>
+                <w:i w:val="0"/>
+                <w:color w:val="15803D"/>
+                <w:sz w:val="16"/>
+              </w:rPr>
+              <w:t>+15.0000 BTC</w:t>
+            </w:r>
+          </w:p>
+        </w:tc>
+        <w:tc>
+          <w:tcPr>
+            <w:tcW w:type="dxa" w:w="1644"/>
+            <w:tcBorders>
+              <w:bottom w:val="single" w:sz="4" w:color="D0D5DD"/>
+            </w:tcBorders>
+            <w:vAlign w:val="center"/>
+          </w:tcPr>
+          <w:p>
+            <w:pPr>
+              <w:spacing w:before="40" w:after="40"/>
+              <w:jc w:val="right"/>
+            </w:pPr>
+            <w:r>
+              <w:rPr>
+                <w:rFonts w:ascii="Arial" w:hAnsi="Arial"/>
+                <w:rFonts w:ascii="Arial" w:hAnsi="Arial" w:cs="Arial"/>
+                <w:b w:val="0"/>
+                <w:i w:val="0"/>
+                <w:color w:val="4A5568"/>
+                <w:sz w:val="16"/>
+              </w:rPr>
+              <w:t>$81,000.00</w:t>
+            </w:r>
+          </w:p>
+        </w:tc>
+        <w:tc>
+          <w:tcPr>
+            <w:tcW w:type="dxa" w:w="1077"/>
+            <w:tcBorders>
+              <w:bottom w:val="single" w:sz="4" w:color="D0D5DD"/>
+            </w:tcBorders>
+            <w:vAlign w:val="center"/>
+          </w:tcPr>
+          <w:p>
+            <w:pPr>
+              <w:spacing w:before="40" w:after="40"/>
+              <w:jc w:val="right"/>
+            </w:pPr>
+            <w:r>
+              <w:rPr>
+                <w:rFonts w:ascii="Arial" w:hAnsi="Arial"/>
+                <w:rFonts w:ascii="Arial" w:hAnsi="Arial" w:cs="Arial"/>
+                <w:b w:val="0"/>
+                <w:i w:val="0"/>
+                <w:color w:val="4A5568"/>
+                <w:sz w:val="16"/>
+              </w:rPr>
+              <w:t>2</w:t>
+            </w:r>
+          </w:p>
+        </w:tc>
+        <w:tc>
+          <w:tcPr>
+            <w:tcW w:type="dxa" w:w="1587"/>
+            <w:tcBorders>
+              <w:bottom w:val="single" w:sz="4" w:color="D0D5DD"/>
+            </w:tcBorders>
+            <w:vAlign w:val="center"/>
+          </w:tcPr>
+          <w:p>
+            <w:pPr>
+              <w:spacing w:before="40" w:after="40"/>
+              <w:jc w:val="right"/>
+            </w:pPr>
+            <w:r>
+              <w:rPr>
+                <w:rFonts w:ascii="Arial" w:hAnsi="Arial"/>
+                <w:rFonts w:ascii="Arial" w:hAnsi="Arial" w:cs="Arial"/>
+                <w:b w:val="0"/>
+                <w:i w:val="0"/>
+                <w:color w:val="4A5568"/>
+                <w:sz w:val="16"/>
+              </w:rPr>
+              <w:t>—</w:t>
+            </w:r>
+          </w:p>
+        </w:tc>
+      </w:tr>
+      <w:tr>
+        <w:tc>
+          <w:tcPr>
+            <w:tcW w:type="dxa" w:w="1304"/>
+            <w:shd w:val="clear" w:color="auto" w:fill="F5F7FA"/>
+            <w:tcBorders>
+              <w:bottom w:val="single" w:sz="4" w:color="D0D5DD"/>
+            </w:tcBorders>
+            <w:vAlign w:val="center"/>
+          </w:tcPr>
+          <w:p>
+            <w:pPr>
+              <w:spacing w:before="40" w:after="40"/>
+            </w:pPr>
+            <w:r>
+              <w:rPr>
+                <w:rFonts w:ascii="Arial" w:hAnsi="Arial"/>
+                <w:rFonts w:ascii="Arial" w:hAnsi="Arial" w:cs="Arial"/>
+                <w:b w:val="0"/>
+                <w:i w:val="0"/>
+                <w:color w:val="4A5568"/>
+                <w:sz w:val="16"/>
+              </w:rPr>
+              <w:t>ETH/USD</w:t>
+            </w:r>
+          </w:p>
+        </w:tc>
+        <w:tc>
+          <w:tcPr>
+            <w:tcW w:type="dxa" w:w="964"/>
+            <w:shd w:val="clear" w:color="auto" w:fill="F5F7FA"/>
+            <w:tcBorders>
+              <w:bottom w:val="single" w:sz="4" w:color="D0D5DD"/>
+            </w:tcBorders>
+            <w:vAlign w:val="center"/>
+          </w:tcPr>
+          <w:p>
+            <w:pPr>
+              <w:spacing w:before="40" w:after="40"/>
+              <w:jc w:val="right"/>
+            </w:pPr>
+            <w:r>
+              <w:rPr>
+                <w:rFonts w:ascii="Arial" w:hAnsi="Arial"/>
+                <w:rFonts w:ascii="Arial" w:hAnsi="Arial" w:cs="Arial"/>
+                <w:b w:val="0"/>
+                <w:i w:val="0"/>
+                <w:color w:val="4A5568"/>
+                <w:sz w:val="16"/>
+              </w:rPr>
+              <w:t>1</w:t>
+            </w:r>
+          </w:p>
+        </w:tc>
+        <w:tc>
+          <w:tcPr>
+            <w:tcW w:type="dxa" w:w="1757"/>
+            <w:shd w:val="clear" w:color="auto" w:fill="F5F7FA"/>
+            <w:tcBorders>
+              <w:bottom w:val="single" w:sz="4" w:color="D0D5DD"/>
+            </w:tcBorders>
+            <w:vAlign w:val="center"/>
+          </w:tcPr>
+          <w:p>
+            <w:pPr>
+              <w:spacing w:before="40" w:after="40"/>
+              <w:jc w:val="right"/>
+            </w:pPr>
+            <w:r>
+              <w:rPr>
+                <w:rFonts w:ascii="Arial" w:hAnsi="Arial"/>
+                <w:rFonts w:ascii="Arial" w:hAnsi="Arial" w:cs="Arial"/>
+                <w:b w:val="0"/>
+                <w:i w:val="0"/>
+                <w:color w:val="4A5568"/>
+                <w:sz w:val="16"/>
+              </w:rPr>
+              <w:t>$211,500.00</w:t>
+            </w:r>
+          </w:p>
+        </w:tc>
+        <w:tc>
+          <w:tcPr>
+            <w:tcW w:type="dxa" w:w="1871"/>
+            <w:shd w:val="clear" w:color="auto" w:fill="F5F7FA"/>
+            <w:tcBorders>
+              <w:bottom w:val="single" w:sz="4" w:color="D0D5DD"/>
+            </w:tcBorders>
+            <w:vAlign w:val="center"/>
+          </w:tcPr>
+          <w:p>
+            <w:pPr>
+              <w:spacing w:before="40" w:after="40"/>
+              <w:jc w:val="right"/>
+            </w:pPr>
+            <w:r>
+              <w:rPr>
+                <w:rFonts w:ascii="Arial" w:hAnsi="Arial"/>
+                <w:rFonts w:ascii="Arial" w:hAnsi="Arial" w:cs="Arial"/>
+                <w:b w:val="0"/>
+                <w:i w:val="0"/>
+                <w:color w:val="B91C1C"/>
+                <w:sz w:val="16"/>
+              </w:rPr>
+              <w:t>-50.0000 ETH</w:t>
+            </w:r>
+          </w:p>
+        </w:tc>
+        <w:tc>
+          <w:tcPr>
+            <w:tcW w:type="dxa" w:w="1644"/>
+            <w:shd w:val="clear" w:color="auto" w:fill="F5F7FA"/>
+            <w:tcBorders>
+              <w:bottom w:val="single" w:sz="4" w:color="D0D5DD"/>
+            </w:tcBorders>
+            <w:vAlign w:val="center"/>
+          </w:tcPr>
+          <w:p>
+            <w:pPr>
+              <w:spacing w:before="40" w:after="40"/>
+              <w:jc w:val="right"/>
+            </w:pPr>
+            <w:r>
+              <w:rPr>
+                <w:rFonts w:ascii="Arial" w:hAnsi="Arial"/>
+                <w:rFonts w:ascii="Arial" w:hAnsi="Arial" w:cs="Arial"/>
+                <w:b w:val="0"/>
+                <w:i w:val="0"/>
+                <w:color w:val="4A5568"/>
+                <w:sz w:val="16"/>
+              </w:rPr>
+              <w:t>$4,230.00</w:t>
+            </w:r>
+          </w:p>
+        </w:tc>
+        <w:tc>
+          <w:tcPr>
+            <w:tcW w:type="dxa" w:w="1077"/>
+            <w:shd w:val="clear" w:color="auto" w:fill="F5F7FA"/>
+            <w:tcBorders>
+              <w:bottom w:val="single" w:sz="4" w:color="D0D5DD"/>
+            </w:tcBorders>
+            <w:vAlign w:val="center"/>
+          </w:tcPr>
+          <w:p>
+            <w:pPr>
+              <w:spacing w:before="40" w:after="40"/>
+              <w:jc w:val="right"/>
+            </w:pPr>
+            <w:r>
+              <w:rPr>
+                <w:rFonts w:ascii="Arial" w:hAnsi="Arial"/>
+                <w:rFonts w:ascii="Arial" w:hAnsi="Arial" w:cs="Arial"/>
+                <w:b w:val="0"/>
+                <w:i w:val="0"/>
+                <w:color w:val="4A5568"/>
+                <w:sz w:val="16"/>
+              </w:rPr>
+              <w:t>1</w:t>
+            </w:r>
+          </w:p>
+        </w:tc>
+        <w:tc>
+          <w:tcPr>
+            <w:tcW w:type="dxa" w:w="1587"/>
+            <w:shd w:val="clear" w:color="auto" w:fill="F5F7FA"/>
+            <w:tcBorders>
+              <w:bottom w:val="single" w:sz="4" w:color="D0D5DD"/>
+            </w:tcBorders>
+            <w:vAlign w:val="center"/>
+          </w:tcPr>
+          <w:p>
+            <w:pPr>
+              <w:spacing w:before="40" w:after="40"/>
+              <w:jc w:val="right"/>
+            </w:pPr>
+            <w:r>
+              <w:rPr>
+                <w:rFonts w:ascii="Arial" w:hAnsi="Arial"/>
+                <w:rFonts w:ascii="Arial" w:hAnsi="Arial" w:cs="Arial"/>
+                <w:b w:val="0"/>
+                <w:i w:val="0"/>
+                <w:color w:val="4A5568"/>
+                <w:sz w:val="16"/>
+              </w:rPr>
+              <w:t>—</w:t>
+            </w:r>
+          </w:p>
+        </w:tc>
+      </w:tr>
+      <w:tr>
+        <w:tc>
+          <w:tcPr>
+            <w:tcW w:type="dxa" w:w="1304"/>
             <w:shd w:val="clear" w:color="auto" w:fill="E5EBF1"/>
             <w:tcBorders>
               <w:bottom w:val="single" w:sz="4" w:color="D0D5DD"/>
@@ -2231,7 +2794,7 @@
                 <w:color w:val="0A2342"/>
                 <w:sz w:val="16"/>
               </w:rPr>
-              <w:t>16</w:t>
+              <w:t>24</w:t>
             </w:r>
           </w:p>
         </w:tc>
@@ -2258,7 +2821,7 @@
                 <w:color w:val="0A2342"/>
                 <w:sz w:val="16"/>
               </w:rPr>
-              <w:t>$6,213,840.00</w:t>
+              <w:t>$8,390,340.00</w:t>
             </w:r>
           </w:p>
         </w:tc>
@@ -2339,7 +2902,7 @@
                 <w:color w:val="0A2342"/>
                 <w:sz w:val="16"/>
               </w:rPr>
-              <w:t>14</w:t>
+              <w:t>22</w:t>
             </w:r>
           </w:p>
         </w:tc>

</xml_diff>